<commit_message>
paper PDF ready, pandoc paper_draft.md -o paper_cnib.docx --reference-doc=cnib_template.docm
</commit_message>
<xml_diff>
--- a/paper_cnib.docx
+++ b/paper_cnib.docx
@@ -67,7 +67,7 @@
         <w:t xml:space="preserve"> </w:t>
       </w:r>
       <w:r>
-        <w:t xml:space="preserve">using a low-cost EMG-IMU wearable system. Rather than treating IMU and EMG as conventionally</w:t>
+        <w:t xml:space="preserve">using a low-cost EMG–IMU wearable system. Rather than treating IMU and EMG as conventionally</w:t>
       </w:r>
       <w:r>
         <w:t xml:space="preserve"> </w:t>
@@ -79,7 +79,7 @@
         <w:t xml:space="preserve"> </w:t>
       </w:r>
       <w:r>
-        <w:t xml:space="preserve">serves as an independent biomechanical context channel. In a 63-min continuous tennis session</w:t>
+        <w:t xml:space="preserve">serves as an independent biomechanical context channel. In a 63.1-min continuous tennis session</w:t>
       </w:r>
       <w:r>
         <w:t xml:space="preserve"> </w:t>
@@ -97,25 +97,31 @@
         <w:t xml:space="preserve"> </w:t>
       </w:r>
       <w:r>
-        <w:t xml:space="preserve">(167.6 ± 50.1 Hz), and late-session decline (149.5 ± 45.1 Hz) consistent with local</w:t>
-      </w:r>
-      <w:r>
-        <w:t xml:space="preserve"> </w:t>
-      </w:r>
-      <w:r>
-        <w:t xml:space="preserve">forearm fatigue. Warmup-skip sensitivity showed baseline selection is a first-order determinant:</w:t>
-      </w:r>
-      <w:r>
-        <w:t xml:space="preserve"> </w:t>
-      </w:r>
-      <w:r>
-        <w:t xml:space="preserve">a 10-min skip produced -2.6% MDF change while a 20-min skip revealed a 28.1% MDF decline and</w:t>
-      </w:r>
-      <w:r>
-        <w:t xml:space="preserve"> </w:t>
-      </w:r>
-      <w:r>
-        <w:t xml:space="preserve">17.3% MNF decline. IMU peak gyro magnitude remained stable (r = +0.029, p = 0.468), suggesting</w:t>
+        <w:t xml:space="preserve">(167.6 ± 50.1 Hz), and late-session decline (149.5 ± 45.1 Hz) consistent with a local</w:t>
+      </w:r>
+      <w:r>
+        <w:t xml:space="preserve"> </w:t>
+      </w:r>
+      <w:r>
+        <w:t xml:space="preserve">forearm fatigue-related spectral shift after the interface stabilized. Warmup-skip</w:t>
+      </w:r>
+      <w:r>
+        <w:t xml:space="preserve"> </w:t>
+      </w:r>
+      <w:r>
+        <w:t xml:space="preserve">sensitivity showed baseline selection is a first-order determinant: a 10-min skip produced</w:t>
+      </w:r>
+      <w:r>
+        <w:t xml:space="preserve"> </w:t>
+      </w:r>
+      <w:r>
+        <w:t xml:space="preserve">−2.6% MDF change, a 15-min skip produced −26.2%, while a 20-min skip revealed a 28.1% MDF</w:t>
+      </w:r>
+      <w:r>
+        <w:t xml:space="preserve"> </w:t>
+      </w:r>
+      <w:r>
+        <w:t xml:space="preserve">decline and 17.3% MNF decline. IMU peak gyro magnitude remained stable (r = +0.029, p = 0.468), suggesting</w:t>
       </w:r>
       <w:r>
         <w:t xml:space="preserve"> </w:t>
@@ -139,7 +145,7 @@
         <w:t xml:space="preserve"> </w:t>
       </w:r>
       <w:r>
-        <w:t xml:space="preserve">fatigue monitoring requires a trustworthiness-first analysis approach.</w:t>
+        <w:t xml:space="preserve">fatigue monitoring should be treated as a trustworthiness-first problem, requiring settling-aware baseline selection, contact-quality monitoring, IMU-conditioned interpretation, and continuity-aware session analysis.</w:t>
       </w:r>
     </w:p>
     <w:bookmarkStart w:id="20" w:name="introduction"/>
@@ -164,7 +170,13 @@
         <w:pStyle w:val="BodyText"/>
       </w:pPr>
       <w:r>
-        <w:t xml:space="preserve">Prior EMG fatigue studies in tennis used controlled laboratory conditions with gel electrodes and skin abrasion [2,3,4]. In real court deployment, gel and abrasion are impractical: gel smears during play and affects racket grip, and players resist pre-session preparation. This study intentionally evaluates a no-added-gel, field-deployable configuration, following the standard for wearable sports deployment [5]. In this setting, electrode-skin impedance starts high and decreases over time as sweat hydrates the interface — a process that can take substantially longer than the 5–10 min warmup skip commonly assumed in laboratory analyses.</w:t>
+        <w:t xml:space="preserve">Prior EMG fatigue studies in tennis used controlled laboratory conditions with gel electrodes and skin abrasion [2,3,4]. In real court deployment, gel and abrasion are impractical: gel smears during play and affects racket grip, and players resist pre-session preparation. This study intentionally evaluates a no-added-gel, field-deployable configuration because routine on-court monitoring requires fast setup and minimal interference with play; this contrasts with SENIAM-style laboratory preparation where skin preparation and gel are recommended [5]. In this setting, electrode-skin impedance starts high and decreases over time as sweat hydrates the interface — a process that can make short fixed warmup exclusions such as 5–10 min insufficient.</w:t>
+      </w:r>
+      <w:r>
+        <w:t xml:space="preserve"> </w:t>
+      </w:r>
+      <w:r>
+        <w:t xml:space="preserve">Prior dry-electrode and wearable sEMG studies identify electrode-skin impedance, contact quality, and motion artifacts as major reliability factors [9,10,14,15], but they do not quantify how no-gel forearm electrode settling affects MDF/MNF fatigue interpretation during real tennis play.</w:t>
       </w:r>
     </w:p>
     <w:p>
@@ -342,7 +354,7 @@
         <w:t xml:space="preserve"> </w:t>
       </w:r>
       <w:r>
-        <w:t xml:space="preserve">Gel and skin preparation are standard in laboratory EMG [5] but were not used. This study intentionally evaluates a no-added-gel, field-deployable configuration, motivating the characterisation of dry-electrode settling under field conditions.</w:t>
+        <w:t xml:space="preserve">Gel and skin preparation are standard in laboratory EMG [5] but were not used. This study intentionally evaluates a no-added-gel, field-deployable configuration, motivating the characterization of dry-electrode settling under field conditions.</w:t>
       </w:r>
     </w:p>
     <w:p>
@@ -360,7 +372,25 @@
         <w:t xml:space="preserve"> </w:t>
       </w:r>
       <w:r>
-        <w:t xml:space="preserve">When a dry snap electrode is applied to unabraded skin, the interface presents high impedance (10–100 kΩ). Two processes reduce it: (1) sweat accumulation — eccrine glands produce saline that hydrates the electrode-skin gap; (2) Ag/AgCl half-cell equilibration — the electrode potential drifts toward equilibrium with the local electrolyte. During settling, the unstable high-impedance interface degrades common-mode rejection and increases low-frequency-dominant contamination near the lower part of the 50–450 Hz analysis band, pulling MDF downward.</w:t>
+        <w:t xml:space="preserve">When a dry snap electrode is applied to unabraded skin, the interface can present high impedance, often on the order of tens of kΩ in dry-electrode contexts (inferred indirectly from MDF/RMS behavior, not measured directly in this study). Two processes reduce it: (1) sweat accumulation — eccrine glands produce saline that hydrates the electrode-skin gap; (2) Ag/AgCl half-cell equilibration — the electrode potential drifts toward equilibrium with the local electrolyte. During settling, the unstable high-impedance interface degrades common-mode rejection and increases low-frequency-dominant contamination near the lower part of the 50–450 Hz analysis band, pulling MDF downward.</w:t>
+      </w:r>
+    </w:p>
+    <w:p>
+      <w:pPr>
+        <w:pStyle w:val="BodyText"/>
+      </w:pPr>
+      <w:r>
+        <w:rPr>
+          <w:b/>
+          <w:bCs/>
+        </w:rPr>
+        <w:t xml:space="preserve">Signal processing.</w:t>
+      </w:r>
+      <w:r>
+        <w:t xml:space="preserve"> </w:t>
+      </w:r>
+      <w:r>
+        <w:t xml:space="preserve">For each detected swing, RAW EMG was detrended, bandpass-filtered (50–450 Hz), notch-filtered at 60 and 120 Hz, and Welch PSD was computed to extract MDF and MNF per swing.</w:t>
       </w:r>
     </w:p>
     <w:p>
@@ -703,11 +733,11 @@
         <w:t xml:space="preserve"> </w:t>
       </w:r>
       <w:r>
-        <w:t xml:space="preserve">log0305: 63 min, 626 swings, single continuous BLE connection. log0303: 88 min, 197 swings, two BLE connections with a 66-min reconnection gap.</w:t>
+        <w:t xml:space="preserve">log0305: 63.1 min, 626 swings, single continuous BLE connection. log0303: 87.9 min, 197 swings, two BLE connections with a 66-min reconnection gap.</w:t>
       </w:r>
     </w:p>
     <w:bookmarkEnd w:id="22"/>
-    <w:bookmarkStart w:id="39" w:name="results"/>
+    <w:bookmarkStart w:id="40" w:name="results"/>
     <w:p>
       <w:pPr>
         <w:pStyle w:val="heading 2"/>
@@ -730,7 +760,7 @@
         <w:pStyle w:val="FirstParagraph"/>
       </w:pPr>
       <w:r>
-        <w:t xml:space="preserve">Figure 2 shows the central empirical finding: a three-phase MDF trajectory rather than a simple monotonic decline.</w:t>
+        <w:t xml:space="preserve">Figure 1 shows the central empirical finding: a three-phase MDF trajectory rather than a simple monotonic decline.</w:t>
       </w:r>
     </w:p>
     <w:p>
@@ -742,7 +772,7 @@
           <wp:inline>
             <wp:extent cx="4381500" cy="3983181"/>
             <wp:effectExtent b="0" l="0" r="0" t="0"/>
-            <wp:docPr descr="Figure 2. Three-phase MDF trajectory in log0305. Panel A: full-session MDF with three shaded phases — Phase I (settling, 0–18 min), Phase II (stable reference, 18–38 min), Phase III (fatigue-consistent, 38–63 min). Warmup markers at 10/15/20 min shown. Panel B: phase mean ± std bar chart. Panel C: IMU flat across all phases (r = +0.029, p = 0.468). IMU peak magnitude is a kinematic proxy, not a direct force measurement." title="" id="24" name="Picture"/>
+            <wp:docPr descr="Figure 1. Three-phase MDF trajectory in log0305. Panel A: full-session MDF with three shaded phases — Phase I (settling, 0–21 min), Phase II (stable reference, 21–42 min), Phase III (fatigue-consistent, 42–63 min). Warmup markers at 10/15/20 min shown. Panel B: phase mean ± std bar chart. Panel C: IMU flat across all phases (r = +0.029, p = 0.468). IMU peak magnitude is a kinematic proxy, not a direct force measurement." title="" id="24" name="Picture"/>
             <a:graphic>
               <a:graphicData uri="http://schemas.openxmlformats.org/drawingml/2006/picture">
                 <pic:pic>
@@ -785,7 +815,7 @@
         <w:pStyle w:val="ImageCaption"/>
       </w:pPr>
       <w:r>
-        <w:t xml:space="preserve">Figure 2. Three-phase MDF trajectory in log0305. Panel A: full-session MDF with three shaded phases — Phase I (settling, 0–18 min), Phase II (stable reference, 18–38 min), Phase III (fatigue-consistent, 38–63 min). Warmup markers at 10/15/20 min shown. Panel B: phase mean ± std bar chart. Panel C: IMU flat across all phases (r = +0.029, p = 0.468). IMU peak magnitude is a kinematic proxy, not a direct force measurement.</w:t>
+        <w:t xml:space="preserve">Figure 1. Three-phase MDF trajectory in log0305. Panel A: full-session MDF with three shaded phases — Phase I (settling, 0–21 min), Phase II (stable reference, 21–42 min), Phase III (fatigue-consistent, 42–63 min). Warmup markers at 10/15/20 min shown. Panel B: phase mean ± std bar chart. Panel C: IMU flat across all phases (r = +0.029, p = 0.468). IMU peak magnitude is a kinematic proxy, not a direct force measurement.</w:t>
       </w:r>
     </w:p>
     <w:p>
@@ -827,7 +857,7 @@
         <w:pStyle w:val="FirstParagraph"/>
       </w:pPr>
       <w:r>
-        <w:t xml:space="preserve">Figure 3 shows that the same session gives completely different fatigue conclusions depending on warmup exclusion.</w:t>
+        <w:t xml:space="preserve">Figure 2 shows that the same session gives completely different fatigue conclusions depending on warmup exclusion.</w:t>
       </w:r>
     </w:p>
     <w:p>
@@ -839,7 +869,7 @@
           <wp:inline>
             <wp:extent cx="4381500" cy="1685192"/>
             <wp:effectExtent b="0" l="0" r="0" t="0"/>
-            <wp:docPr descr="Figure 3. Warmup-skip sensitivity. Left: baseline MDF per skip condition vs. stable settled reference (166 Hz). Right: MDF drop % per condition. Positive = MDF declined (fatigue-consistent); negative = inverted/missed." title="" id="28" name="Picture"/>
+            <wp:docPr descr="Figure 2. Warmup-skip sensitivity. Left: baseline MDF per skip condition vs. stable settled reference (166 Hz). Right: MDF drop % per condition. Positive = MDF declined (fatigue-consistent); negative = inverted/missed." title="" id="28" name="Picture"/>
             <a:graphic>
               <a:graphicData uri="http://schemas.openxmlformats.org/drawingml/2006/picture">
                 <pic:pic>
@@ -882,7 +912,7 @@
         <w:pStyle w:val="ImageCaption"/>
       </w:pPr>
       <w:r>
-        <w:t xml:space="preserve">Figure 3. Warmup-skip sensitivity. Left: baseline MDF per skip condition vs. stable settled reference (166 Hz). Right: MDF drop % per condition. Positive = MDF declined (fatigue-consistent); negative = inverted/missed.</w:t>
+        <w:t xml:space="preserve">Figure 2. Warmup-skip sensitivity. Left: baseline MDF per skip condition vs. stable settled reference (166 Hz). Right: MDF drop % per condition. Positive = MDF declined (fatigue-consistent); negative = inverted/missed.</w:t>
       </w:r>
     </w:p>
     <w:p>
@@ -890,7 +920,27 @@
         <w:pStyle w:val="BodyText"/>
       </w:pPr>
       <w:r>
-        <w:t xml:space="preserve">A 10-min skip produces −2.6% MDF change (fatigue-consistent decline missed entirely). A 15-min skip produces −26.2% (inverted — baseline still in settling). A 20-min skip reveals +28.1% MDF decline and +17.3% MNF decline. The non-monotone behaviour (15-min worse than 10-min) reflects the RMS-based baseline selector catching swings from the steepest part of the settling transition. These results demonstrate that warmup-skip sensitivity analysis is a necessary robustness audit for no-gel field sEMG fatigue studies.</w:t>
+        <w:t xml:space="preserve">A 10-min skip produces −2.6% MDF change (fatigue-consistent decline missed entirely). A 15-min skip produces −26.2% (inverted — baseline still in settling). A 20-min skip reveals +28.1% MDF decline and +17.3% MNF decline. The non-monotone behavior (15-min worse than 10-min) reflects the RMS-based baseline selector catching swings from the steepest part of the settling transition. These results demonstrate that warmup-skip sensitivity analysis is a necessary robustness audit for no-gel field sEMG fatigue studies.</w:t>
+      </w:r>
+    </w:p>
+    <w:p>
+      <w:pPr>
+        <w:pStyle w:val="BodyText"/>
+      </w:pPr>
+      <w:r>
+        <w:t xml:space="preserve">Note on reference values: 167.6 Hz is the mid-session phase mean from the three-phase analysis (best</w:t>
+      </w:r>
+      <w:r>
+        <w:t xml:space="preserve"> </w:t>
+      </w:r>
+      <w:r>
+        <w:t xml:space="preserve">“settled reference”</w:t>
+      </w:r>
+      <w:r>
+        <w:t xml:space="preserve"> </w:t>
+      </w:r>
+      <w:r>
+        <w:t xml:space="preserve">for narrative); 199.2 Hz is the baseline selected by the 20-min fixed-skip pipeline (used for the 28.1% result). Both confirm that 10–15 min baselines remained contaminated.</w:t>
       </w:r>
     </w:p>
     <w:bookmarkEnd w:id="30"/>
@@ -908,7 +958,7 @@
         <w:pStyle w:val="FirstParagraph"/>
       </w:pPr>
       <w:r>
-        <w:t xml:space="preserve">Figure 4 shows the IMU–EMG diagnostic matrix, the visual proof of IMU-conditioned validity.</w:t>
+        <w:t xml:space="preserve">Figure 3 shows the IMU–EMG diagnostic matrix, the visual evidence for IMU-conditioned validity.</w:t>
       </w:r>
     </w:p>
     <w:p>
@@ -920,7 +970,7 @@
           <wp:inline>
             <wp:extent cx="4381500" cy="3407833"/>
             <wp:effectExtent b="0" l="0" r="0" t="0"/>
-            <wp:docPr descr="Figure 4. IMU–EMG diagnostic matrix (log0305). IMU peak gyro magnitude (x-axis, kinematic proxy) vs. MDF (y-axis) for all 626 swings, coloured by session third. Early and Late swings cluster at lower MDF than Mid despite similar IMU intensity. IMU peak magnitude remained flat (r = +0.029, p = 0.468). IMU is a kinematic proxy, not a direct force measurement." title="" id="32" name="Picture"/>
+            <wp:docPr descr="Figure 3. IMU–EMG diagnostic matrix (log0305). IMU peak gyro magnitude (x-axis, kinematic proxy) vs. MDF (y-axis) for all 626 swings, colored by session third. Early and Late swings cluster at lower MDF than Mid despite similar IMU intensity. IMU peak magnitude remained flat (r = +0.029, p = 0.468). IMU is a kinematic proxy, not a direct force measurement." title="" id="32" name="Picture"/>
             <a:graphic>
               <a:graphicData uri="http://schemas.openxmlformats.org/drawingml/2006/picture">
                 <pic:pic>
@@ -963,7 +1013,7 @@
         <w:pStyle w:val="ImageCaption"/>
       </w:pPr>
       <w:r>
-        <w:t xml:space="preserve">Figure 4. IMU–EMG diagnostic matrix (log0305). IMU peak gyro magnitude (x-axis, kinematic proxy) vs. MDF (y-axis) for all 626 swings, coloured by session third. Early and Late swings cluster at lower MDF than Mid despite similar IMU intensity. IMU peak magnitude remained flat (r = +0.029, p = 0.468). IMU is a kinematic proxy, not a direct force measurement.</w:t>
+        <w:t xml:space="preserve">Figure 3. IMU–EMG diagnostic matrix (log0305). IMU peak gyro magnitude (x-axis, kinematic proxy) vs. MDF (y-axis) for all 626 swings, colored by session third. Early and Late swings cluster at lower MDF than Mid despite similar IMU intensity. IMU peak magnitude remained flat (r = +0.029, p = 0.468). IMU is a kinematic proxy, not a direct force measurement.</w:t>
       </w:r>
     </w:p>
     <w:p>
@@ -975,13 +1025,13 @@
       </w:r>
     </w:p>
     <w:bookmarkEnd w:id="34"/>
-    <w:bookmarkStart w:id="38" w:name="session-gap-artifact-log0303"/>
+    <w:bookmarkStart w:id="35" w:name="contact-quality"/>
     <w:p>
       <w:pPr>
         <w:pStyle w:val="heading 3"/>
       </w:pPr>
       <w:r>
-        <w:t xml:space="preserve">4.4 Session-Gap Artifact (log0303)</w:t>
+        <w:t xml:space="preserve">4.4 Contact Quality</w:t>
       </w:r>
     </w:p>
     <w:p>
@@ -989,7 +1039,34 @@
         <w:pStyle w:val="FirstParagraph"/>
       </w:pPr>
       <w:r>
-        <w:t xml:space="preserve">Figure 5 shows the log0303 continuity failure mode.</w:t>
+        <w:t xml:space="preserve">The RMS-normalized contact-quality metric (</w:t>
+      </w:r>
+      <w:r>
+        <w:rPr>
+          <w:rStyle w:val="VerbatimChar"/>
+        </w:rPr>
+        <w:t xml:space="preserve">contact_quality(t) = RMS(t) / session_p90_rms</w:t>
+      </w:r>
+      <w:r>
+        <w:t xml:space="preserve">) provided a qualitative indicator of contact and activation state. In log0305, contact quality increased from early to mid-session (0.36 ± 0.28 to 0.49 ± 0.47) and declined late (0.25 ± 0.32), consistent with electrode settling followed by later activation-amplitude changes. In log0303, contact quality differed substantially between segments (Segment 1: 0.26 vs. Segment 2: 0.59), supporting the interpretation that the full-session MDF drop reflected a change in electrode contact state across the gap rather than a continuous physiological fatigue trend. Because RMS also depends on muscle activation, the metric is interpreted qualitatively together with MDF trajectory, IMU stability, and session continuity.</w:t>
+      </w:r>
+    </w:p>
+    <w:bookmarkEnd w:id="35"/>
+    <w:bookmarkStart w:id="39" w:name="session-gap-artifact-log0303"/>
+    <w:p>
+      <w:pPr>
+        <w:pStyle w:val="heading 3"/>
+      </w:pPr>
+      <w:r>
+        <w:t xml:space="preserve">4.5 Session-Gap Artifact (log0303)</w:t>
+      </w:r>
+    </w:p>
+    <w:p>
+      <w:pPr>
+        <w:pStyle w:val="FirstParagraph"/>
+      </w:pPr>
+      <w:r>
+        <w:t xml:space="preserve">Figure 4 shows the log0303 continuity failure mode.</w:t>
       </w:r>
     </w:p>
     <w:p>
@@ -1001,18 +1078,18 @@
           <wp:inline>
             <wp:extent cx="4381500" cy="2190750"/>
             <wp:effectExtent b="0" l="0" r="0" t="0"/>
-            <wp:docPr descr="Figure 5. log0303 gap artifact. Full session (orange): apparent 28.7% MDF drop. First continuous BLE segment alone (navy diamonds, 0–13.5 min): 4.9% change. A 66-min BLE reconnection gap separates the two segments (purple shading)." title="" id="36" name="Picture"/>
+            <wp:docPr descr="Figure 4. log0303 gap artifact. Full session (orange): apparent 28.7% MDF drop. First continuous BLE segment alone (navy diamonds, 0–13.5 min): 4.9% change. A 66-min BLE reconnection gap separates the two segments (purple shading)." title="" id="37" name="Picture"/>
             <a:graphic>
               <a:graphicData uri="http://schemas.openxmlformats.org/drawingml/2006/picture">
                 <pic:pic>
                   <pic:nvPicPr>
-                    <pic:cNvPr descr="paper_figures/fig6_log0303_gap_artifact.png" id="37" name="Picture"/>
+                    <pic:cNvPr descr="paper_figures/fig6_log0303_gap_artifact.png" id="38" name="Picture"/>
                     <pic:cNvPicPr>
                       <a:picLocks noChangeArrowheads="1" noChangeAspect="1"/>
                     </pic:cNvPicPr>
                   </pic:nvPicPr>
                   <pic:blipFill>
-                    <a:blip r:embed="rId35"/>
+                    <a:blip r:embed="rId36"/>
                     <a:stretch>
                       <a:fillRect/>
                     </a:stretch>
@@ -1044,7 +1121,7 @@
         <w:pStyle w:val="ImageCaption"/>
       </w:pPr>
       <w:r>
-        <w:t xml:space="preserve">Figure 5. log0303 gap artifact. Full session (orange): apparent 28.7% MDF drop. First continuous BLE segment alone (navy diamonds, 0–13.5 min): 4.9% change. A 66-min BLE reconnection gap separates the two segments (purple shading).</w:t>
+        <w:t xml:space="preserve">Figure 4. log0303 gap artifact. Full session (orange): apparent 28.7% MDF drop. First continuous BLE segment alone (navy diamonds, 0–13.5 min): 4.9% change. A 66-min BLE reconnection gap separates the two segments (purple shading).</w:t>
       </w:r>
     </w:p>
     <w:p>
@@ -1052,12 +1129,12 @@
         <w:pStyle w:val="BodyText"/>
       </w:pPr>
       <w:r>
-        <w:t xml:space="preserve">The full-session 28.7% MDF drop compares Segment 1 (fresh electrode) against Segment 2 (re-applied electrode, different contact state) across a 66-min gap. Segment 1 alone shows 4.9% — below any meaningful fatigue threshold for 13.5 min of play. Treating disconnected BLE recordings as continuous physiological sessions is a real wearable failure mode requiring continuity auditing.</w:t>
-      </w:r>
-    </w:p>
-    <w:bookmarkEnd w:id="38"/>
+        <w:t xml:space="preserve">The full-session 28.7% MDF drop compares Segment 1 against Segment 2 across a 66-min gap during which electrode contact state and player condition may have changed. Segment 1 alone shows 4.9% — below any meaningful fatigue threshold for 13.5 min of play. Treating disconnected BLE recordings as continuous physiological sessions is a real wearable failure mode requiring continuity auditing. Therefore, log0303 was not treated as a valid within-session fatigue result.</w:t>
+      </w:r>
+    </w:p>
     <w:bookmarkEnd w:id="39"/>
-    <w:bookmarkStart w:id="40" w:name="discussion"/>
+    <w:bookmarkEnd w:id="40"/>
+    <w:bookmarkStart w:id="41" w:name="discussion"/>
     <w:p>
       <w:pPr>
         <w:pStyle w:val="heading 2"/>
@@ -1081,7 +1158,7 @@
         <w:t xml:space="preserve"> </w:t>
       </w:r>
       <w:r>
-        <w:t xml:space="preserve">The MDF trajectory was not monotonic. Phase I (0–18 min) reflects electrode contact evolution, not fatigue — MDF subsequently recovered to Phase II while IMU swing intensity remained flat. Phase III (38–63 min) occurs after the settled reference and is fatigue-consistent. This three-phase pattern explains why both short warmup skips failed: 10 and 15 min fall inside Phase I, producing contaminated or inverted baselines.</w:t>
+        <w:t xml:space="preserve">The MDF trajectory was not monotonic. Phase I (0–21 min) reflects electrode contact evolution, not fatigue — MDF subsequently recovered to Phase II while IMU swing intensity remained flat. Phase III (42–63 min) occurs after the settled reference and is fatigue-consistent. This three-phase pattern explains why both short warmup skips failed: 10 and 15 min fall inside Phase I, producing contaminated or inverted baselines.</w:t>
       </w:r>
     </w:p>
     <w:p>
@@ -1135,7 +1212,7 @@
         <w:t xml:space="preserve"> </w:t>
       </w:r>
       <w:r>
-        <w:t xml:space="preserve">Single player, two sessions (pilot case study); no MVC, RPE, grip-force, or ball-speed ground truth — findings are fatigue-consistent rather than physiologically confirmed; settling duration varies with sweat rate, ambient conditions, and electrode state; the 20-min skip is empirically selected for this session (not a universal threshold); per-swing statistics are descriptive rather than population-level inference; contact quality not validated against direct impedance.</w:t>
+        <w:t xml:space="preserve">Single player, two sessions (pilot case study); no MVC, RPE, grip-force, or ball-speed ground truth — findings are fatigue-consistent rather than physiologically confirmed; settling duration varies with sweat rate, ambient conditions, and electrode state; no direct in-session impedance measurement — settling is inferred indirectly from MDF/RMS behavior; the 20-min skip is empirically selected for this session (not a universal threshold); per-swing statistics are descriptive rather than population-level inference; contact quality not validated against direct impedance.</w:t>
       </w:r>
     </w:p>
     <w:p>
@@ -1156,8 +1233,8 @@
         <w:t xml:space="preserve">Multi-player study with RPE integration and MVC validation; adaptive warmup skip calibrated across sessions; multi-session workload monitoring toward overuse-risk assessment.</w:t>
       </w:r>
     </w:p>
-    <w:bookmarkEnd w:id="40"/>
-    <w:bookmarkStart w:id="41" w:name="conclusion"/>
+    <w:bookmarkEnd w:id="41"/>
+    <w:bookmarkStart w:id="42" w:name="conclusion"/>
     <w:p>
       <w:pPr>
         <w:pStyle w:val="heading 2"/>
@@ -1174,8 +1251,8 @@
         <w:t xml:space="preserve">The key observation is not simply that MDF decreased, but that MDF first recovered from early contact-induced suppression before declining later — a three-phase trajectory separating electrode settling from fatigue-consistent spectral change. In no-gel field tennis sEMG, the same session changed from −2.6% to +28.1% MDF drop depending only on the warmup exclusion window, demonstrating that baseline selection is a first-order determinant of fatigue interpretation. The onboard IMU, as an independent kinematic context channel, provides a zero-cost reference for EMG validity assessment. A second session demonstrated that a 66-min BLE reconnection gap created an apparent 28.7% fatigue signal that disappeared to 4.9% for the first continuous segment. These findings establish a trustworthiness-first framework for wearable sEMG fatigue monitoring in field sports deployment.</w:t>
       </w:r>
     </w:p>
-    <w:bookmarkEnd w:id="41"/>
-    <w:bookmarkStart w:id="42" w:name="references"/>
+    <w:bookmarkEnd w:id="42"/>
+    <w:bookmarkStart w:id="43" w:name="references"/>
     <w:p>
       <w:pPr>
         <w:pStyle w:val="heading 2"/>
@@ -1265,7 +1342,7 @@
         </w:numPr>
       </w:pPr>
       <w:r>
-        <w:t xml:space="preserve">Bangaru SS, Wang C, Aghazadeh F. Automated and continuous fatigue monitoring using forearm EMG and IMU sensors and recurrent neural network. Sensors. 2022;22(21):8217.</w:t>
+        <w:t xml:space="preserve">Bangaru SS, Wang C, Aghazadeh F. Automated and continuous fatigue monitoring in construction workers using forearm EMG and IMU wearable sensors and recurrent neural network. Sensors. 2022;22(24):9729.</w:t>
       </w:r>
     </w:p>
     <w:p>
@@ -1364,577 +1441,7 @@
         <w:t xml:space="preserve">Farago E, MacIsaac D, Suk M, et al. A review of techniques for surface electromyography signal quality analysis. IEEE Rev Biomed Eng. 2022;16:494–511.</w:t>
       </w:r>
     </w:p>
-    <w:p>
-      <w:pPr>
-        <w:pStyle w:val="FirstParagraph"/>
-      </w:pPr>
-      <w:r>
-        <w:t xml:space="preserve">Surface electromyography (sEMG) can quantify local muscle fatigue through spectral metrics such as median frequency (MDF) and mean frequency (MNF), which shift toward lower values as conduction velocity decreases with metabolite accumulation. Tennis players can often perceive general tiredness, but subjective perception is not a quantitative, muscle-specific measure of local fatigue. Objective EMG monitoring may complement perception by enabling session-to-session workload tracking and future overuse-risk assessment — upper-extremity tennis injuries are frequently chronic and repetitive, and lateral elbow tendinopathy is associated with repeated forearm muscle loading [1]. However, a player may maintain swing speed through compensation even as local forearm muscle physiology changes, making external kinematics an insufficient proxy.</w:t>
-      </w:r>
-    </w:p>
-    <w:p>
-      <w:pPr>
-        <w:pStyle w:val="BodyText"/>
-      </w:pPr>
-      <w:r>
-        <w:t xml:space="preserve">Prior EMG fatigue studies in tennis used controlled laboratory conditions with gel electrodes and skin abrasion [2,3,4]. In real court deployment, gel and abrasion are impractical: gel smears during play and affects racket grip, and players resist pre-session preparation. This study intentionally evaluates a no-added-gel, field-deployable configuration, following the standard for wearable sports deployment [5]. In this setting, electrode-skin impedance starts high and decreases over time as sweat hydrates the interface — a process that can take substantially longer than the 5–10 min warmup skip commonly assumed in laboratory analyses.</w:t>
-      </w:r>
-    </w:p>
-    <w:p>
-      <w:pPr>
-        <w:pStyle w:val="BodyText"/>
-      </w:pPr>
-      <w:r>
-        <w:t xml:space="preserve">Existing IMU–EMG wearable studies typically fuse both modalities as feature sources for activity or fatigue classification [6,7]. In contrast, this work uses the IMU as an</w:t>
-      </w:r>
-      <w:r>
-        <w:t xml:space="preserve"> </w:t>
-      </w:r>
-      <w:r>
-        <w:rPr>
-          <w:b/>
-          <w:bCs/>
-        </w:rPr>
-        <w:t xml:space="preserve">independent biomechanical context sensor</w:t>
-      </w:r>
-      <w:r>
-        <w:t xml:space="preserve"> </w:t>
-      </w:r>
-      <w:r>
-        <w:t xml:space="preserve">for EMG validity assessment. Because tennis swings generate repeatable forearm kinematic signatures, stable IMU swing intensity provides a reference: when EMG changes while IMU is stable, the cause — electrode settling, contact degradation, or local muscle fatigue — can be inferred from temporal context.</w:t>
-      </w:r>
-    </w:p>
-    <w:p>
-      <w:pPr>
-        <w:pStyle w:val="BodyText"/>
-      </w:pPr>
-      <w:r>
-        <w:rPr>
-          <w:b/>
-          <w:bCs/>
-        </w:rPr>
-        <w:t xml:space="preserve">Contributions:</w:t>
-      </w:r>
-      <w:r>
-        <w:t xml:space="preserve"> </w:t>
-      </w:r>
-      <w:r>
-        <w:t xml:space="preserve">(C1) Field characterization of electrode settling (≥17–20 min in no-gel tennis); (C2) warmup-skip sensitivity as a required robustness audit; (C3) contact-quality-aware EMG interpretation; (C4) IMU-conditioned EMG validity framework; (C5) session-gap artifact detection in wearable fatigue analysis.</w:t>
-      </w:r>
-    </w:p>
-    <w:p>
-      <w:r>
-        <w:pict>
-          <v:rect style="width:0;height:1.5pt" o:hralign="center" o:hrstd="t" o:hr="t"/>
-        </w:pict>
-      </w:r>
-    </w:p>
-    <w:bookmarkEnd w:id="42"/>
-    <w:bookmarkStart w:id="43" w:name="system-design-1"/>
-    <w:p>
-      <w:pPr>
-        <w:pStyle w:val="heading 2"/>
-      </w:pPr>
-      <w:r>
-        <w:t xml:space="preserve">2. System Design</w:t>
-      </w:r>
-    </w:p>
-    <w:p>
-      <w:pPr>
-        <w:pStyle w:val="FirstParagraph"/>
-      </w:pPr>
-      <w:r>
-        <w:rPr>
-          <w:b/>
-          <w:bCs/>
-        </w:rPr>
-        <w:t xml:space="preserve">Hardware.</w:t>
-      </w:r>
-      <w:r>
-        <w:t xml:space="preserve"> </w:t>
-      </w:r>
-      <w:r>
-        <w:t xml:space="preserve">The system uses a MyoWare 2.0 muscle sensor (2000 Hz, 12-bit ADC, ENV + RAW dual outputs), ICM-20948 IMU (200 Hz, ±2000 dps / ±8g), and ESP32 MCU with BLE streaming — approximately $99 total. The RAW signal (required for spectral analysis) is routed via a direct solder bypass from the MyoWare PTH pad to ESP32 GPIO 32, correcting a field-discovered pogo-pin routing failure that produced a ghost signal indistinguishable by eye but flatlined after preprocessing. REF electrode was placed over the lateral epicondyle (bony prominence, opposite side of forearm from flexors), consistent with vendor guidance [8]. ADC DMA at 40 kHz with 10× oversampling yields ±25 µs timestamp accuracy at 2000 Hz.</w:t>
-      </w:r>
-    </w:p>
-    <w:p>
-      <w:pPr>
-        <w:pStyle w:val="BodyText"/>
-      </w:pPr>
-      <w:r>
-        <w:rPr>
-          <w:b/>
-          <w:bCs/>
-        </w:rPr>
-        <w:t xml:space="preserve">Software pipeline.</w:t>
-      </w:r>
-      <w:r>
-        <w:t xml:space="preserve"> </w:t>
-      </w:r>
-      <w:r>
-        <w:rPr>
-          <w:rStyle w:val="VerbatimChar"/>
-        </w:rPr>
-        <w:t xml:space="preserve">btCentral.py</w:t>
-      </w:r>
-      <w:r>
-        <w:t xml:space="preserve"> </w:t>
-      </w:r>
-      <w:r>
-        <w:t xml:space="preserve">(BLE central, Python/Bleak) streams binary TLV frames to rotating CSV logs.</w:t>
-      </w:r>
-      <w:r>
-        <w:t xml:space="preserve"> </w:t>
-      </w:r>
-      <w:r>
-        <w:rPr>
-          <w:rStyle w:val="VerbatimChar"/>
-        </w:rPr>
-        <w:t xml:space="preserve">capture_loader.py</w:t>
-      </w:r>
-      <w:r>
-        <w:t xml:space="preserve"> </w:t>
-      </w:r>
-      <w:r>
-        <w:t xml:space="preserve">reconstructs a hybrid</w:t>
-      </w:r>
-      <w:r>
-        <w:t xml:space="preserve"> </w:t>
-      </w:r>
-      <w:r>
-        <w:rPr>
-          <w:rStyle w:val="VerbatimChar"/>
-        </w:rPr>
-        <w:t xml:space="preserve">abs_us</w:t>
-      </w:r>
-      <w:r>
-        <w:t xml:space="preserve"> </w:t>
-      </w:r>
-      <w:r>
-        <w:t xml:space="preserve">timeline — using device timestamps within each BLE connection and host receive-time gaps between reconnections — enabling correct detection of session discontinuities.</w:t>
-      </w:r>
-      <w:r>
-        <w:t xml:space="preserve"> </w:t>
-      </w:r>
-      <w:r>
-        <w:rPr>
-          <w:rStyle w:val="VerbatimChar"/>
-        </w:rPr>
-        <w:t xml:space="preserve">emg_util_yaml_runner.py</w:t>
-      </w:r>
-      <w:r>
-        <w:t xml:space="preserve"> </w:t>
-      </w:r>
-      <w:r>
-        <w:t xml:space="preserve">performs per-swing MDF/MNF/RMS feature extraction.</w:t>
-      </w:r>
-    </w:p>
-    <w:p>
-      <w:pPr>
-        <w:pStyle w:val="BodyText"/>
-      </w:pPr>
-      <w:r>
-        <w:rPr>
-          <w:b/>
-          <w:bCs/>
-        </w:rPr>
-        <w:t xml:space="preserve">Swing detection.</w:t>
-      </w:r>
-      <w:r>
-        <w:t xml:space="preserve"> </w:t>
-      </w:r>
-      <w:r>
-        <w:t xml:space="preserve">Fixed 300 dps gyro magnitude threshold with 2000 ms debounce. Z-score adaptive approaches failed because forearm gyro distributions during tennis are continuous ramps (no natural valley between general movement and swings). The 300 dps threshold sits at the 88th percentile of the session distribution, cleanly separating swing peaks.</w:t>
-      </w:r>
-    </w:p>
-    <w:p>
-      <w:r>
-        <w:pict>
-          <v:rect style="width:0;height:1.5pt" o:hralign="center" o:hrstd="t" o:hr="t"/>
-        </w:pict>
-      </w:r>
-    </w:p>
     <w:bookmarkEnd w:id="43"/>
-    <w:bookmarkStart w:id="44" w:name="methods-1"/>
-    <w:p>
-      <w:pPr>
-        <w:pStyle w:val="heading 2"/>
-      </w:pPr>
-      <w:r>
-        <w:t xml:space="preserve">3. Methods</w:t>
-      </w:r>
-    </w:p>
-    <w:p>
-      <w:pPr>
-        <w:pStyle w:val="FirstParagraph"/>
-      </w:pPr>
-      <w:r>
-        <w:rPr>
-          <w:b/>
-          <w:bCs/>
-        </w:rPr>
-        <w:t xml:space="preserve">Electrode preparation.</w:t>
-      </w:r>
-      <w:r>
-        <w:t xml:space="preserve"> </w:t>
-      </w:r>
-      <w:r>
-        <w:t xml:space="preserve">Gel and skin preparation are standard in laboratory EMG [5] but were not used. This study intentionally evaluates a no-added-gel, field-deployable configuration, motivating the characterisation of dry-electrode settling under field conditions.</w:t>
-      </w:r>
-    </w:p>
-    <w:p>
-      <w:pPr>
-        <w:pStyle w:val="BodyText"/>
-      </w:pPr>
-      <w:r>
-        <w:rPr>
-          <w:b/>
-          <w:bCs/>
-        </w:rPr>
-        <w:t xml:space="preserve">Physical basis of settling.</w:t>
-      </w:r>
-      <w:r>
-        <w:t xml:space="preserve"> </w:t>
-      </w:r>
-      <w:r>
-        <w:t xml:space="preserve">When a dry snap electrode is applied to unabraded skin, the interface presents high impedance (10–100 kΩ). Two processes reduce it: (1) sweat accumulation — eccrine glands produce saline that hydrates the electrode-skin gap; (2) Ag/AgCl half-cell equilibration — the electrode potential drifts toward equilibrium with the local electrolyte. During settling, the unstable high-impedance interface degrades common-mode rejection and increases low-frequency-dominant contamination near the lower part of the 50–450 Hz analysis band, pulling MDF downward.</w:t>
-      </w:r>
-    </w:p>
-    <w:p>
-      <w:pPr>
-        <w:pStyle w:val="BodyText"/>
-      </w:pPr>
-      <w:r>
-        <w:rPr>
-          <w:b/>
-          <w:bCs/>
-        </w:rPr>
-        <w:t xml:space="preserve">IMU-conditioned EMG interpretation framework.</w:t>
-      </w:r>
-      <w:r>
-        <w:t xml:space="preserve"> </w:t>
-      </w:r>
-      <w:r>
-        <w:t xml:space="preserve">We define Table 1 to distinguish EMG spectral changes by their IMU/session context.</w:t>
-      </w:r>
-    </w:p>
-    <w:p>
-      <w:pPr>
-        <w:pStyle w:val="BodyText"/>
-      </w:pPr>
-      <w:r>
-        <w:rPr>
-          <w:b/>
-          <w:bCs/>
-        </w:rPr>
-        <w:t xml:space="preserve">Table 1. IMU-conditioned interpretation of EMG spectral changes.</w:t>
-      </w:r>
-    </w:p>
-    <w:tbl>
-      <w:tblPr>
-        <w:tblStyle w:val="Table"/>
-        <w:tblW w:type="pct" w:w="5000"/>
-        <w:tblLayout w:type="fixed"/>
-        <w:tblLook w:firstRow="1" w:lastRow="0" w:firstColumn="0" w:lastColumn="0" w:noHBand="0" w:noVBand="0" w:val="0020"/>
-      </w:tblPr>
-      <w:tblGrid>
-        <w:gridCol w:w="2640"/>
-        <w:gridCol w:w="2640"/>
-        <w:gridCol w:w="2640"/>
-      </w:tblGrid>
-      <w:tr>
-        <w:trPr>
-          <w:tblHeader w:val="on"/>
-        </w:trPr>
-        <w:tc>
-          <w:tcPr/>
-          <w:p>
-            <w:pPr>
-              <w:pStyle w:val="Compact"/>
-            </w:pPr>
-            <w:r>
-              <w:t xml:space="preserve">IMU / session context</w:t>
-            </w:r>
-          </w:p>
-        </w:tc>
-        <w:tc>
-          <w:tcPr/>
-          <w:p>
-            <w:pPr>
-              <w:pStyle w:val="Compact"/>
-            </w:pPr>
-            <w:r>
-              <w:t xml:space="preserve">EMG observation</w:t>
-            </w:r>
-          </w:p>
-        </w:tc>
-        <w:tc>
-          <w:tcPr/>
-          <w:p>
-            <w:pPr>
-              <w:pStyle w:val="Compact"/>
-            </w:pPr>
-            <w:r>
-              <w:t xml:space="preserve">Likely interpretation</w:t>
-            </w:r>
-          </w:p>
-        </w:tc>
-      </w:tr>
-      <w:tr>
-        <w:tc>
-          <w:tcPr/>
-          <w:p>
-            <w:pPr>
-              <w:pStyle w:val="Compact"/>
-            </w:pPr>
-            <w:r>
-              <w:t xml:space="preserve">Stable swing intensity</w:t>
-            </w:r>
-          </w:p>
-        </w:tc>
-        <w:tc>
-          <w:tcPr/>
-          <w:p>
-            <w:pPr>
-              <w:pStyle w:val="Compact"/>
-            </w:pPr>
-            <w:r>
-              <w:t xml:space="preserve">Early low MDF recovering upward</w:t>
-            </w:r>
-          </w:p>
-        </w:tc>
-        <w:tc>
-          <w:tcPr/>
-          <w:p>
-            <w:pPr>
-              <w:pStyle w:val="Compact"/>
-            </w:pPr>
-            <w:r>
-              <w:t xml:space="preserve">Electrode settling / contact hydration</w:t>
-            </w:r>
-          </w:p>
-        </w:tc>
-      </w:tr>
-      <w:tr>
-        <w:tc>
-          <w:tcPr/>
-          <w:p>
-            <w:pPr>
-              <w:pStyle w:val="Compact"/>
-            </w:pPr>
-            <w:r>
-              <w:t xml:space="preserve">Stable swing intensity</w:t>
-            </w:r>
-          </w:p>
-        </w:tc>
-        <w:tc>
-          <w:tcPr/>
-          <w:p>
-            <w:pPr>
-              <w:pStyle w:val="Compact"/>
-            </w:pPr>
-            <w:r>
-              <w:t xml:space="preserve">Gradual post-settling MDF/MNF decline</w:t>
-            </w:r>
-          </w:p>
-        </w:tc>
-        <w:tc>
-          <w:tcPr/>
-          <w:p>
-            <w:pPr>
-              <w:pStyle w:val="Compact"/>
-            </w:pPr>
-            <w:r>
-              <w:t xml:space="preserve">Fatigue-consistent spectral shift</w:t>
-            </w:r>
-          </w:p>
-        </w:tc>
-      </w:tr>
-      <w:tr>
-        <w:tc>
-          <w:tcPr/>
-          <w:p>
-            <w:pPr>
-              <w:pStyle w:val="Compact"/>
-            </w:pPr>
-            <w:r>
-              <w:t xml:space="preserve">Declining swing intensity</w:t>
-            </w:r>
-          </w:p>
-        </w:tc>
-        <w:tc>
-          <w:tcPr/>
-          <w:p>
-            <w:pPr>
-              <w:pStyle w:val="Compact"/>
-            </w:pPr>
-            <w:r>
-              <w:t xml:space="preserve">MDF decline</w:t>
-            </w:r>
-          </w:p>
-        </w:tc>
-        <w:tc>
-          <w:tcPr/>
-          <w:p>
-            <w:pPr>
-              <w:pStyle w:val="Compact"/>
-            </w:pPr>
-            <w:r>
-              <w:t xml:space="preserve">Reduced effort may contribute</w:t>
-            </w:r>
-          </w:p>
-        </w:tc>
-      </w:tr>
-      <w:tr>
-        <w:tc>
-          <w:tcPr/>
-          <w:p>
-            <w:pPr>
-              <w:pStyle w:val="Compact"/>
-            </w:pPr>
-            <w:r>
-              <w:t xml:space="preserve">Large IMU shock/vibration</w:t>
-            </w:r>
-          </w:p>
-        </w:tc>
-        <w:tc>
-          <w:tcPr/>
-          <w:p>
-            <w:pPr>
-              <w:pStyle w:val="Compact"/>
-            </w:pPr>
-            <w:r>
-              <w:t xml:space="preserve">Isolated EMG spectral outlier</w:t>
-            </w:r>
-          </w:p>
-        </w:tc>
-        <w:tc>
-          <w:tcPr/>
-          <w:p>
-            <w:pPr>
-              <w:pStyle w:val="Compact"/>
-            </w:pPr>
-            <w:r>
-              <w:t xml:space="preserve">Candidate mechanical artifact</w:t>
-            </w:r>
-          </w:p>
-        </w:tc>
-      </w:tr>
-      <w:tr>
-        <w:tc>
-          <w:tcPr/>
-          <w:p>
-            <w:pPr>
-              <w:pStyle w:val="Compact"/>
-            </w:pPr>
-            <w:r>
-              <w:t xml:space="preserve">BLE/session discontinuity</w:t>
-            </w:r>
-          </w:p>
-        </w:tc>
-        <w:tc>
-          <w:tcPr/>
-          <w:p>
-            <w:pPr>
-              <w:pStyle w:val="Compact"/>
-            </w:pPr>
-            <w:r>
-              <w:t xml:space="preserve">EMG baseline shift</w:t>
-            </w:r>
-          </w:p>
-        </w:tc>
-        <w:tc>
-          <w:tcPr/>
-          <w:p>
-            <w:pPr>
-              <w:pStyle w:val="Compact"/>
-            </w:pPr>
-            <w:r>
-              <w:t xml:space="preserve">Cross-segment artifact</w:t>
-            </w:r>
-          </w:p>
-        </w:tc>
-      </w:tr>
-    </w:tbl>
-    <w:p>
-      <w:pPr>
-        <w:pStyle w:val="BodyText"/>
-      </w:pPr>
-      <w:r>
-        <w:t xml:space="preserve">The diagnostic value comes from modality mismatch: when IMU swing intensity remains stable but EMG spectral metrics change, the change is unlikely to be caused by reduced gross swing motion.</w:t>
-      </w:r>
-    </w:p>
-    <w:p>
-      <w:pPr>
-        <w:pStyle w:val="BodyText"/>
-      </w:pPr>
-      <w:r>
-        <w:rPr>
-          <w:b/>
-          <w:bCs/>
-        </w:rPr>
-        <w:t xml:space="preserve">Warmup-skip sensitivity analysis.</w:t>
-      </w:r>
-      <w:r>
-        <w:t xml:space="preserve"> </w:t>
-      </w:r>
-      <w:r>
-        <w:t xml:space="preserve">We re-ran the analysis with warmup exclusion windows of 10, 15, and 20 min to quantify how baseline selection affects the fatigue conclusion. The 20-min skip is the primary result; warmup-skip sensitivity is reported as a robustness audit.</w:t>
-      </w:r>
-    </w:p>
-    <w:p>
-      <w:pPr>
-        <w:pStyle w:val="BodyText"/>
-      </w:pPr>
-      <w:r>
-        <w:rPr>
-          <w:b/>
-          <w:bCs/>
-        </w:rPr>
-        <w:t xml:space="preserve">Contact quality.</w:t>
-      </w:r>
-      <w:r>
-        <w:t xml:space="preserve"> </w:t>
-      </w:r>
-      <w:r>
-        <w:rPr>
-          <w:rStyle w:val="VerbatimChar"/>
-        </w:rPr>
-        <w:t xml:space="preserve">contact_quality(t) = RMS(t) / session_p90_rms</w:t>
-      </w:r>
-      <w:r>
-        <w:t xml:space="preserve"> </w:t>
-      </w:r>
-      <w:r>
-        <w:t xml:space="preserve">— used as a qualitative relative indicator; not validated against direct impedance.</w:t>
-      </w:r>
-    </w:p>
-    <w:p>
-      <w:pPr>
-        <w:pStyle w:val="BodyText"/>
-      </w:pPr>
-      <w:r>
-        <w:rPr>
-          <w:b/>
-          <w:bCs/>
-        </w:rPr>
-        <w:t xml:space="preserve">Sessions.</w:t>
-      </w:r>
-      <w:r>
-        <w:t xml:space="preserve"> </w:t>
-      </w:r>
-      <w:r>
-        <w:t xml:space="preserve">log0305: 63 min, 626 swings, single continuous BLE connection. log0303: 88 min, 197 swings, two BLE connections with a 66-min reconnection gap.</w:t>
-      </w:r>
-    </w:p>
-    <w:p>
-      <w:r>
-        <w:pict>
-          <v:rect style="width:0;height:1.5pt" o:hralign="center" o:hrstd="t" o:hr="t"/>
-        </w:pict>
-      </w:r>
-    </w:p>
-    <w:bookmarkEnd w:id="44"/>
     <w:sectPr>
       <w:headerReference r:id="rId10" w:type="even"/>
       <w:headerReference r:id="rId11" w:type="default"/>

</xml_diff>